<commit_message>
docs: clarify that admins can also view risk scores
Mention that administrators and authorized officials can view the same
risk information as company representatives, both in the all-companies
list and in the per-company detail view.

Update user guide, admin guide, and regenerate Word documents.
</commit_message>
<xml_diff>
--- a/docs/user-guide.docx
+++ b/docs/user-guide.docx
@@ -18399,6 +18399,14 @@
       </w:pPr>
       <w:r>
         <w:t xml:space="preserve">Ettevõtte esindaja saab sisselogides vaadata oma ettevõtte riskitaset. Süsteem kontrollib TARA autentimise järel, kas isikul on äriregistri andmetel ettevõtja esindaja õigus.</w:t>
+      </w:r>
+    </w:p>
+    <w:p>
+      <w:pPr>
+        <w:pStyle w:val="BodyText"/>
+      </w:pPr>
+      <w:r>
+        <w:t xml:space="preserve">Sama riskiteavet saavad vaadata ka administraatorid ja volitatud ametnikud — kas kõigi ettevõtete loendina või konkreetse ettevõtte detailvaates.</w:t>
       </w:r>
     </w:p>
     <w:p>

</xml_diff>

<commit_message>
docs: add user guide section on audit log viewing
Adds `docs/user-guide/17-auditilogi.md` and appends it to the combined
`docs/user-guide.md`, covering how to open the audit log, what is logged,
how to search/filter, the log entry structure, and event examples.

Regenerates `docs/user-guide.docx` and updates the TODO list.
</commit_message>
<xml_diff>
--- a/docs/user-guide.docx
+++ b/docs/user-guide.docx
@@ -2,7 +2,7 @@
 <file path=word/document.xml><?xml version="1.0" encoding="utf-8"?>
 <w:document xmlns:w="http://schemas.openxmlformats.org/wordprocessingml/2006/main" xmlns:m="http://schemas.openxmlformats.org/officeDocument/2006/math" xmlns:r="http://schemas.openxmlformats.org/officeDocument/2006/relationships" xmlns:o="urn:schemas-microsoft-com:office:office" xmlns:v="urn:schemas-microsoft-com:vml" xmlns:w10="urn:schemas-microsoft-com:office:word" xmlns:a="http://schemas.openxmlformats.org/drawingml/2006/main" xmlns:pic="http://schemas.openxmlformats.org/drawingml/2006/picture" xmlns:wp="http://schemas.openxmlformats.org/drawingml/2006/wordprocessingDrawing">
   <w:body>
-    <w:bookmarkStart w:id="203" w:name="ljvis2-kasutajajuhend"/>
+    <w:bookmarkStart w:id="213" w:name="ljvis2-kasutajajuhend"/>
     <w:p>
       <w:pPr>
         <w:pStyle w:val="Heading1"/>
@@ -18556,7 +18556,749 @@
       </w:r>
     </w:p>
     <w:bookmarkEnd w:id="202"/>
+    <w:bookmarkStart w:id="203" w:name="auditilogi-vaatamine"/>
+    <w:p>
+      <w:pPr>
+        <w:pStyle w:val="Heading2"/>
+      </w:pPr>
+      <w:r>
+        <w:t xml:space="preserve">Auditilogi vaatamine</w:t>
+      </w:r>
+    </w:p>
+    <w:p>
+      <w:pPr>
+        <w:pStyle w:val="FirstParagraph"/>
+      </w:pPr>
+      <w:r>
+        <w:t xml:space="preserve">Auditilogi kuvab süsteemis toimunud olulisi tegevusi. See on abivahend, mille abil saab jälgida, kes millal mida tegi.</w:t>
+      </w:r>
+    </w:p>
     <w:bookmarkEnd w:id="203"/>
+    <w:bookmarkStart w:id="204" w:name="ligipääs"/>
+    <w:p>
+      <w:pPr>
+        <w:pStyle w:val="Heading2"/>
+      </w:pPr>
+      <w:r>
+        <w:t xml:space="preserve">Ligipääs</w:t>
+      </w:r>
+    </w:p>
+    <w:p>
+      <w:pPr>
+        <w:pStyle w:val="FirstParagraph"/>
+      </w:pPr>
+      <w:r>
+        <w:t xml:space="preserve">Auditilogi avamiseks vali menüüst</w:t>
+      </w:r>
+      <w:r>
+        <w:t xml:space="preserve"> </w:t>
+      </w:r>
+      <w:r>
+        <w:rPr>
+          <w:b/>
+          <w:bCs/>
+        </w:rPr>
+        <w:t xml:space="preserve">Haldus → Auditilogi</w:t>
+      </w:r>
+      <w:r>
+        <w:t xml:space="preserve">.</w:t>
+      </w:r>
+    </w:p>
+    <w:p>
+      <w:pPr>
+        <w:pStyle w:val="BodyText"/>
+      </w:pPr>
+      <w:r>
+        <w:t xml:space="preserve">Õigus:</w:t>
+      </w:r>
+      <w:r>
+        <w:t xml:space="preserve"> </w:t>
+      </w:r>
+      <w:r>
+        <w:rPr>
+          <w:rStyle w:val="VerbatimChar"/>
+        </w:rPr>
+        <w:t xml:space="preserve">audit.read</w:t>
+      </w:r>
+    </w:p>
+    <w:bookmarkEnd w:id="204"/>
+    <w:bookmarkStart w:id="205" w:name="mida-logitakse"/>
+    <w:p>
+      <w:pPr>
+        <w:pStyle w:val="Heading2"/>
+      </w:pPr>
+      <w:r>
+        <w:t xml:space="preserve">Mida logitakse</w:t>
+      </w:r>
+    </w:p>
+    <w:p>
+      <w:pPr>
+        <w:pStyle w:val="FirstParagraph"/>
+      </w:pPr>
+      <w:r>
+        <w:t xml:space="preserve">Auditilogi salvestab järgmised sündmused:</w:t>
+      </w:r>
+    </w:p>
+    <w:p>
+      <w:pPr>
+        <w:pStyle w:val="Compact"/>
+        <w:numPr>
+          <w:ilvl w:val="0"/>
+          <w:numId w:val="1052"/>
+        </w:numPr>
+      </w:pPr>
+      <w:r>
+        <w:t xml:space="preserve">kasutaja vaatamine ja muutmine</w:t>
+      </w:r>
+    </w:p>
+    <w:p>
+      <w:pPr>
+        <w:pStyle w:val="Compact"/>
+        <w:numPr>
+          <w:ilvl w:val="0"/>
+          <w:numId w:val="1052"/>
+        </w:numPr>
+      </w:pPr>
+      <w:r>
+        <w:t xml:space="preserve">kasutajagrupi muutmine</w:t>
+      </w:r>
+    </w:p>
+    <w:p>
+      <w:pPr>
+        <w:pStyle w:val="Compact"/>
+        <w:numPr>
+          <w:ilvl w:val="0"/>
+          <w:numId w:val="1052"/>
+        </w:numPr>
+      </w:pPr>
+      <w:r>
+        <w:t xml:space="preserve">klassifikaatori väärtuse muutmine</w:t>
+      </w:r>
+    </w:p>
+    <w:p>
+      <w:pPr>
+        <w:pStyle w:val="Compact"/>
+        <w:numPr>
+          <w:ilvl w:val="0"/>
+          <w:numId w:val="1052"/>
+        </w:numPr>
+      </w:pPr>
+      <w:r>
+        <w:t xml:space="preserve">vormide loomine, vaatamine ja muutmine</w:t>
+      </w:r>
+    </w:p>
+    <w:p>
+      <w:pPr>
+        <w:pStyle w:val="Compact"/>
+        <w:numPr>
+          <w:ilvl w:val="0"/>
+          <w:numId w:val="1052"/>
+        </w:numPr>
+      </w:pPr>
+      <w:r>
+        <w:t xml:space="preserve">autentimissündmused</w:t>
+      </w:r>
+    </w:p>
+    <w:bookmarkEnd w:id="205"/>
+    <w:bookmarkStart w:id="206" w:name="logi-kirje-koostis"/>
+    <w:p>
+      <w:pPr>
+        <w:pStyle w:val="Heading2"/>
+      </w:pPr>
+      <w:r>
+        <w:t xml:space="preserve">Logi kirje koostis</w:t>
+      </w:r>
+    </w:p>
+    <w:p>
+      <w:pPr>
+        <w:pStyle w:val="FirstParagraph"/>
+      </w:pPr>
+      <w:r>
+        <w:t xml:space="preserve">Iga kirje sisaldab:</w:t>
+      </w:r>
+    </w:p>
+    <w:tbl>
+      <w:tblPr>
+        <w:tblStyle w:val="Table"/>
+        <w:tblW w:type="auto" w:w="0"/>
+        <w:tblLook w:firstRow="1" w:lastRow="0" w:firstColumn="0" w:lastColumn="0" w:noHBand="0" w:noVBand="0" w:val="0020"/>
+      </w:tblPr>
+      <w:tblGrid>
+        <w:gridCol w:w="3960"/>
+        <w:gridCol w:w="3960"/>
+      </w:tblGrid>
+      <w:tr>
+        <w:trPr>
+          <w:tblHeader w:val="on"/>
+        </w:trPr>
+        <w:tc>
+          <w:tcPr/>
+          <w:p>
+            <w:pPr>
+              <w:pStyle w:val="Compact"/>
+            </w:pPr>
+            <w:r>
+              <w:t xml:space="preserve">Väli</w:t>
+            </w:r>
+          </w:p>
+        </w:tc>
+        <w:tc>
+          <w:tcPr/>
+          <w:p>
+            <w:pPr>
+              <w:pStyle w:val="Compact"/>
+            </w:pPr>
+            <w:r>
+              <w:t xml:space="preserve">Selgitus</w:t>
+            </w:r>
+          </w:p>
+        </w:tc>
+      </w:tr>
+      <w:tr>
+        <w:tc>
+          <w:tcPr/>
+          <w:p>
+            <w:pPr>
+              <w:pStyle w:val="Compact"/>
+            </w:pPr>
+            <w:r>
+              <w:t xml:space="preserve">Sündmuse tüüp</w:t>
+            </w:r>
+          </w:p>
+        </w:tc>
+        <w:tc>
+          <w:tcPr/>
+          <w:p>
+            <w:pPr>
+              <w:pStyle w:val="Compact"/>
+            </w:pPr>
+            <w:r>
+              <w:t xml:space="preserve">Näiteks</w:t>
+            </w:r>
+            <w:r>
+              <w:t xml:space="preserve"> </w:t>
+            </w:r>
+            <w:r>
+              <w:rPr>
+                <w:rStyle w:val="VerbatimChar"/>
+              </w:rPr>
+              <w:t xml:space="preserve">user.create</w:t>
+            </w:r>
+            <w:r>
+              <w:t xml:space="preserve">,</w:t>
+            </w:r>
+            <w:r>
+              <w:t xml:space="preserve"> </w:t>
+            </w:r>
+            <w:r>
+              <w:rPr>
+                <w:rStyle w:val="VerbatimChar"/>
+              </w:rPr>
+              <w:t xml:space="preserve">form.view</w:t>
+            </w:r>
+          </w:p>
+        </w:tc>
+      </w:tr>
+      <w:tr>
+        <w:tc>
+          <w:tcPr/>
+          <w:p>
+            <w:pPr>
+              <w:pStyle w:val="Compact"/>
+            </w:pPr>
+            <w:r>
+              <w:t xml:space="preserve">Kategooria</w:t>
+            </w:r>
+          </w:p>
+        </w:tc>
+        <w:tc>
+          <w:tcPr/>
+          <w:p>
+            <w:pPr>
+              <w:pStyle w:val="Compact"/>
+            </w:pPr>
+            <w:r>
+              <w:t xml:space="preserve">Kasutaja, vorm, klassifikaator jne</w:t>
+            </w:r>
+          </w:p>
+        </w:tc>
+      </w:tr>
+      <w:tr>
+        <w:tc>
+          <w:tcPr/>
+          <w:p>
+            <w:pPr>
+              <w:pStyle w:val="Compact"/>
+            </w:pPr>
+            <w:r>
+              <w:t xml:space="preserve">Tegija nimi</w:t>
+            </w:r>
+          </w:p>
+        </w:tc>
+        <w:tc>
+          <w:tcPr/>
+          <w:p>
+            <w:pPr>
+              <w:pStyle w:val="Compact"/>
+            </w:pPr>
+            <w:r>
+              <w:t xml:space="preserve">Kes tegevuse sooritas</w:t>
+            </w:r>
+          </w:p>
+        </w:tc>
+      </w:tr>
+      <w:tr>
+        <w:tc>
+          <w:tcPr/>
+          <w:p>
+            <w:pPr>
+              <w:pStyle w:val="Compact"/>
+            </w:pPr>
+            <w:r>
+              <w:t xml:space="preserve">Tegija isikukoodi räsi</w:t>
+            </w:r>
+          </w:p>
+        </w:tc>
+        <w:tc>
+          <w:tcPr/>
+          <w:p>
+            <w:pPr>
+              <w:pStyle w:val="Compact"/>
+            </w:pPr>
+            <w:r>
+              <w:t xml:space="preserve">Pseudonüümistatud isikukood</w:t>
+            </w:r>
+          </w:p>
+        </w:tc>
+      </w:tr>
+      <w:tr>
+        <w:tc>
+          <w:tcPr/>
+          <w:p>
+            <w:pPr>
+              <w:pStyle w:val="Compact"/>
+            </w:pPr>
+            <w:r>
+              <w:t xml:space="preserve">Kirjeldus</w:t>
+            </w:r>
+          </w:p>
+        </w:tc>
+        <w:tc>
+          <w:tcPr/>
+          <w:p>
+            <w:pPr>
+              <w:pStyle w:val="Compact"/>
+            </w:pPr>
+            <w:r>
+              <w:t xml:space="preserve">Inimloetav selgitus</w:t>
+            </w:r>
+          </w:p>
+        </w:tc>
+      </w:tr>
+      <w:tr>
+        <w:tc>
+          <w:tcPr/>
+          <w:p>
+            <w:pPr>
+              <w:pStyle w:val="Compact"/>
+            </w:pPr>
+            <w:r>
+              <w:t xml:space="preserve">Lisainfo</w:t>
+            </w:r>
+          </w:p>
+        </w:tc>
+        <w:tc>
+          <w:tcPr/>
+          <w:p>
+            <w:pPr>
+              <w:pStyle w:val="Compact"/>
+            </w:pPr>
+            <w:r>
+              <w:t xml:space="preserve">JSON-formaadis detailid</w:t>
+            </w:r>
+          </w:p>
+        </w:tc>
+      </w:tr>
+      <w:tr>
+        <w:tc>
+          <w:tcPr/>
+          <w:p>
+            <w:pPr>
+              <w:pStyle w:val="Compact"/>
+            </w:pPr>
+            <w:r>
+              <w:t xml:space="preserve">Ajatempel</w:t>
+            </w:r>
+          </w:p>
+        </w:tc>
+        <w:tc>
+          <w:tcPr/>
+          <w:p>
+            <w:pPr>
+              <w:pStyle w:val="Compact"/>
+            </w:pPr>
+            <w:r>
+              <w:t xml:space="preserve">Millal tegevus toimus</w:t>
+            </w:r>
+          </w:p>
+        </w:tc>
+      </w:tr>
+    </w:tbl>
+    <w:bookmarkEnd w:id="206"/>
+    <w:bookmarkStart w:id="210" w:name="logi-otsimine"/>
+    <w:p>
+      <w:pPr>
+        <w:pStyle w:val="Heading2"/>
+      </w:pPr>
+      <w:r>
+        <w:t xml:space="preserve">Logi otsimine</w:t>
+      </w:r>
+    </w:p>
+    <w:p>
+      <w:pPr>
+        <w:pStyle w:val="FirstParagraph"/>
+      </w:pPr>
+      <w:r>
+        <w:t xml:space="preserve">Auditilogi lehel saad:</w:t>
+      </w:r>
+    </w:p>
+    <w:p>
+      <w:pPr>
+        <w:pStyle w:val="Compact"/>
+        <w:numPr>
+          <w:ilvl w:val="0"/>
+          <w:numId w:val="1053"/>
+        </w:numPr>
+      </w:pPr>
+      <w:r>
+        <w:t xml:space="preserve">filtreerida sündmuse tüübi järgi</w:t>
+      </w:r>
+    </w:p>
+    <w:p>
+      <w:pPr>
+        <w:pStyle w:val="Compact"/>
+        <w:numPr>
+          <w:ilvl w:val="0"/>
+          <w:numId w:val="1053"/>
+        </w:numPr>
+      </w:pPr>
+      <w:r>
+        <w:t xml:space="preserve">otsida tegija nime järgi</w:t>
+      </w:r>
+    </w:p>
+    <w:p>
+      <w:pPr>
+        <w:pStyle w:val="Compact"/>
+        <w:numPr>
+          <w:ilvl w:val="0"/>
+          <w:numId w:val="1053"/>
+        </w:numPr>
+      </w:pPr>
+      <w:r>
+        <w:t xml:space="preserve">valida kuupäevavahemiku</w:t>
+      </w:r>
+    </w:p>
+    <w:p>
+      <w:pPr>
+        <w:pStyle w:val="Compact"/>
+        <w:numPr>
+          <w:ilvl w:val="0"/>
+          <w:numId w:val="1053"/>
+        </w:numPr>
+      </w:pPr>
+      <w:r>
+        <w:t xml:space="preserve">sorteerida ajatemplite järgi</w:t>
+      </w:r>
+    </w:p>
+    <w:p>
+      <w:pPr>
+        <w:pStyle w:val="Compact"/>
+        <w:numPr>
+          <w:ilvl w:val="0"/>
+          <w:numId w:val="1053"/>
+        </w:numPr>
+      </w:pPr>
+      <w:r>
+        <w:t xml:space="preserve">avada detailvaate, kus näidatakse täpsemaid andmeid ja JSON-i</w:t>
+      </w:r>
+    </w:p>
+    <w:p>
+      <w:pPr>
+        <w:pStyle w:val="FirstParagraph"/>
+      </w:pPr>
+      <w:r>
+        <w:drawing>
+          <wp:inline>
+            <wp:extent cx="5334000" cy="3645059"/>
+            <wp:effectExtent b="0" l="0" r="0" t="0"/>
+            <wp:docPr descr="" title="" id="208" name="Picture"/>
+            <a:graphic>
+              <a:graphicData uri="http://schemas.openxmlformats.org/drawingml/2006/picture">
+                <pic:pic>
+                  <pic:nvPicPr>
+                    <pic:cNvPr descr="_mermaid_images/mermaid_11_f32d616205.png" id="209" name="Picture"/>
+                    <pic:cNvPicPr>
+                      <a:picLocks noChangeArrowheads="1" noChangeAspect="1"/>
+                    </pic:cNvPicPr>
+                  </pic:nvPicPr>
+                  <pic:blipFill>
+                    <a:blip r:embed="rId207"/>
+                    <a:stretch>
+                      <a:fillRect/>
+                    </a:stretch>
+                  </pic:blipFill>
+                  <pic:spPr bwMode="auto">
+                    <a:xfrm>
+                      <a:off x="0" y="0"/>
+                      <a:ext cx="5334000" cy="3645059"/>
+                    </a:xfrm>
+                    <a:prstGeom prst="rect">
+                      <a:avLst/>
+                    </a:prstGeom>
+                    <a:noFill/>
+                    <a:ln w="9525">
+                      <a:noFill/>
+                      <a:headEnd/>
+                      <a:tailEnd/>
+                    </a:ln>
+                  </pic:spPr>
+                </pic:pic>
+              </a:graphicData>
+            </a:graphic>
+          </wp:inline>
+        </w:drawing>
+      </w:r>
+    </w:p>
+    <w:bookmarkEnd w:id="210"/>
+    <w:bookmarkStart w:id="211" w:name="räsiahela-kontroll"/>
+    <w:p>
+      <w:pPr>
+        <w:pStyle w:val="Heading2"/>
+      </w:pPr>
+      <w:r>
+        <w:t xml:space="preserve">Räsiahela kontroll</w:t>
+      </w:r>
+    </w:p>
+    <w:p>
+      <w:pPr>
+        <w:pStyle w:val="FirstParagraph"/>
+      </w:pPr>
+      <w:r>
+        <w:t xml:space="preserve">Auditilogi on varustatud räsiahelaga, mis tagab, et ükski kirje ei oleks vaikimisi muudetud. Räsiahela kontrolli saab teha eraldi funktsiooniga, kui seda on õigus kasutada.</w:t>
+      </w:r>
+    </w:p>
+    <w:bookmarkEnd w:id="211"/>
+    <w:bookmarkStart w:id="212" w:name="näited-sündmustest"/>
+    <w:p>
+      <w:pPr>
+        <w:pStyle w:val="Heading2"/>
+      </w:pPr>
+      <w:r>
+        <w:t xml:space="preserve">Näited sündmustest</w:t>
+      </w:r>
+    </w:p>
+    <w:tbl>
+      <w:tblPr>
+        <w:tblStyle w:val="Table"/>
+        <w:tblW w:type="auto" w:w="0"/>
+        <w:tblLook w:firstRow="1" w:lastRow="0" w:firstColumn="0" w:lastColumn="0" w:noHBand="0" w:noVBand="0" w:val="0020"/>
+      </w:tblPr>
+      <w:tblGrid>
+        <w:gridCol w:w="3960"/>
+        <w:gridCol w:w="3960"/>
+      </w:tblGrid>
+      <w:tr>
+        <w:trPr>
+          <w:tblHeader w:val="on"/>
+        </w:trPr>
+        <w:tc>
+          <w:tcPr/>
+          <w:p>
+            <w:pPr>
+              <w:pStyle w:val="Compact"/>
+            </w:pPr>
+            <w:r>
+              <w:t xml:space="preserve">Sündmus</w:t>
+            </w:r>
+          </w:p>
+        </w:tc>
+        <w:tc>
+          <w:tcPr/>
+          <w:p>
+            <w:pPr>
+              <w:pStyle w:val="Compact"/>
+            </w:pPr>
+            <w:r>
+              <w:t xml:space="preserve">Selgitus</w:t>
+            </w:r>
+          </w:p>
+        </w:tc>
+      </w:tr>
+      <w:tr>
+        <w:tc>
+          <w:tcPr/>
+          <w:p>
+            <w:pPr>
+              <w:pStyle w:val="Compact"/>
+            </w:pPr>
+            <w:r>
+              <w:rPr>
+                <w:rStyle w:val="VerbatimChar"/>
+              </w:rPr>
+              <w:t xml:space="preserve">user.create</w:t>
+            </w:r>
+          </w:p>
+        </w:tc>
+        <w:tc>
+          <w:tcPr/>
+          <w:p>
+            <w:pPr>
+              <w:pStyle w:val="Compact"/>
+            </w:pPr>
+            <w:r>
+              <w:t xml:space="preserve">Uus kasutaja loodud</w:t>
+            </w:r>
+          </w:p>
+        </w:tc>
+      </w:tr>
+      <w:tr>
+        <w:tc>
+          <w:tcPr/>
+          <w:p>
+            <w:pPr>
+              <w:pStyle w:val="Compact"/>
+            </w:pPr>
+            <w:r>
+              <w:rPr>
+                <w:rStyle w:val="VerbatimChar"/>
+              </w:rPr>
+              <w:t xml:space="preserve">user.update</w:t>
+            </w:r>
+          </w:p>
+        </w:tc>
+        <w:tc>
+          <w:tcPr/>
+          <w:p>
+            <w:pPr>
+              <w:pStyle w:val="Compact"/>
+            </w:pPr>
+            <w:r>
+              <w:t xml:space="preserve">Kasutaja andmed muudetud</w:t>
+            </w:r>
+          </w:p>
+        </w:tc>
+      </w:tr>
+      <w:tr>
+        <w:tc>
+          <w:tcPr/>
+          <w:p>
+            <w:pPr>
+              <w:pStyle w:val="Compact"/>
+            </w:pPr>
+            <w:r>
+              <w:rPr>
+                <w:rStyle w:val="VerbatimChar"/>
+              </w:rPr>
+              <w:t xml:space="preserve">user_group.update</w:t>
+            </w:r>
+          </w:p>
+        </w:tc>
+        <w:tc>
+          <w:tcPr/>
+          <w:p>
+            <w:pPr>
+              <w:pStyle w:val="Compact"/>
+            </w:pPr>
+            <w:r>
+              <w:t xml:space="preserve">Kasutajagrupi andmed muudetud</w:t>
+            </w:r>
+          </w:p>
+        </w:tc>
+      </w:tr>
+      <w:tr>
+        <w:tc>
+          <w:tcPr/>
+          <w:p>
+            <w:pPr>
+              <w:pStyle w:val="Compact"/>
+            </w:pPr>
+            <w:r>
+              <w:rPr>
+                <w:rStyle w:val="VerbatimChar"/>
+              </w:rPr>
+              <w:t xml:space="preserve">classifier_value.update</w:t>
+            </w:r>
+          </w:p>
+        </w:tc>
+        <w:tc>
+          <w:tcPr/>
+          <w:p>
+            <w:pPr>
+              <w:pStyle w:val="Compact"/>
+            </w:pPr>
+            <w:r>
+              <w:t xml:space="preserve">Klassifikaatori väärtus muudetud</w:t>
+            </w:r>
+          </w:p>
+        </w:tc>
+      </w:tr>
+      <w:tr>
+        <w:tc>
+          <w:tcPr/>
+          <w:p>
+            <w:pPr>
+              <w:pStyle w:val="Compact"/>
+            </w:pPr>
+            <w:r>
+              <w:rPr>
+                <w:rStyle w:val="VerbatimChar"/>
+              </w:rPr>
+              <w:t xml:space="preserve">form.create</w:t>
+            </w:r>
+          </w:p>
+        </w:tc>
+        <w:tc>
+          <w:tcPr/>
+          <w:p>
+            <w:pPr>
+              <w:pStyle w:val="Compact"/>
+            </w:pPr>
+            <w:r>
+              <w:t xml:space="preserve">Uus vorm loodud</w:t>
+            </w:r>
+          </w:p>
+        </w:tc>
+      </w:tr>
+      <w:tr>
+        <w:tc>
+          <w:tcPr/>
+          <w:p>
+            <w:pPr>
+              <w:pStyle w:val="Compact"/>
+            </w:pPr>
+            <w:r>
+              <w:rPr>
+                <w:rStyle w:val="VerbatimChar"/>
+              </w:rPr>
+              <w:t xml:space="preserve">form.view</w:t>
+            </w:r>
+          </w:p>
+        </w:tc>
+        <w:tc>
+          <w:tcPr/>
+          <w:p>
+            <w:pPr>
+              <w:pStyle w:val="Compact"/>
+            </w:pPr>
+            <w:r>
+              <w:t xml:space="preserve">Vormi vaadati</w:t>
+            </w:r>
+          </w:p>
+        </w:tc>
+      </w:tr>
+    </w:tbl>
+    <w:bookmarkEnd w:id="212"/>
+    <w:bookmarkEnd w:id="213"/>
     <w:sectPr>
       <w:footnotePr>
         <w:numRestart w:val="eachSect"/>
@@ -19198,6 +19940,12 @@
     <w:abstractNumId w:val="991"/>
   </w:num>
   <w:num w:numId="1051">
+    <w:abstractNumId w:val="991"/>
+  </w:num>
+  <w:num w:numId="1052">
+    <w:abstractNumId w:val="991"/>
+  </w:num>
+  <w:num w:numId="1053">
     <w:abstractNumId w:val="991"/>
   </w:num>
 </w:numbering>

</xml_diff>